<commit_message>
Update TDKT version 1.0 build 2026.04.25.
</commit_message>
<xml_diff>
--- a/articles/drafts/Notes-2025.08.02.docx
+++ b/articles/drafts/Notes-2025.08.02.docx
@@ -3542,27 +3542,15 @@
     <w:p/>
     <w:p>
       <w:r>
-        <w:rPr>
-          <w:highlight w:val="yellow"/>
-        </w:rPr>
         <w:t xml:space="preserve">Ngân hàng là cụ thể hóa của lượng tiền lưu thông tức tính chất vật lý của tiền </w:t>
       </w:r>
       <w:r>
-        <w:rPr>
-          <w:highlight w:val="yellow"/>
-        </w:rPr>
         <w:t xml:space="preserve">tệ </w:t>
       </w:r>
       <w:r>
-        <w:rPr>
-          <w:highlight w:val="yellow"/>
-        </w:rPr>
         <w:t>bên cạnh tính quy ước của tiền</w:t>
       </w:r>
       <w:r>
-        <w:rPr>
-          <w:highlight w:val="yellow"/>
-        </w:rPr>
         <w:t xml:space="preserve"> tệ</w:t>
       </w:r>
       <w:r>
@@ -3584,65 +3572,36 @@
     <w:p/>
     <w:p>
       <w:r>
-        <w:rPr>
-          <w:highlight w:val="yellow"/>
-        </w:rPr>
         <w:t>Thu nhập Smith lớn hơn tiền lưu thông</w:t>
       </w:r>
       <w:sdt>
         <w:sdtPr>
-          <w:rPr>
-            <w:highlight w:val="yellow"/>
-          </w:rPr>
           <w:id w:val="-83840774"/>
           <w:citation/>
         </w:sdtPr>
         <w:sdtEndPr/>
         <w:sdtContent>
           <w:r>
-            <w:rPr>
-              <w:highlight w:val="yellow"/>
-            </w:rPr>
-            <w:fldChar w:fldCharType="begin"/>
-          </w:r>
-          <w:r>
-            <w:rPr>
-              <w:highlight w:val="yellow"/>
-            </w:rPr>
+            <w:fldChar w:fldCharType="begin"/>
+          </w:r>
+          <w:r>
             <w:instrText xml:space="preserve">CITATION Smith1776Wealth \p 217 \l 1033 </w:instrText>
           </w:r>
           <w:r>
-            <w:rPr>
-              <w:highlight w:val="yellow"/>
-            </w:rPr>
-            <w:fldChar w:fldCharType="separate"/>
-          </w:r>
-          <w:r>
-            <w:rPr>
-              <w:noProof/>
-              <w:highlight w:val="yellow"/>
-            </w:rPr>
-            <w:t xml:space="preserve"> </w:t>
-          </w:r>
-          <w:r>
-            <w:rPr>
-              <w:noProof/>
-              <w:highlight w:val="yellow"/>
-            </w:rPr>
-            <w:t>(Smith, 1776, p. 217)</w:t>
-          </w:r>
-          <w:r>
-            <w:rPr>
-              <w:highlight w:val="yellow"/>
-            </w:rPr>
-            <w:fldChar w:fldCharType="end"/>
-          </w:r>
-        </w:sdtContent>
-      </w:sdt>
-      <w:r>
-        <w:rPr>
-          <w:highlight w:val="yellow"/>
-        </w:rPr>
+            <w:fldChar w:fldCharType="separate"/>
+          </w:r>
+          <w:r>
+            <w:rPr>
+              <w:noProof/>
+            </w:rPr>
+            <w:t xml:space="preserve"> (Smith, 1776, p. 217)</w:t>
+          </w:r>
+          <w:r>
+            <w:fldChar w:fldCharType="end"/>
+          </w:r>
+        </w:sdtContent>
+      </w:sdt>
+      <w:r>
         <w:t>.</w:t>
       </w:r>
       <w:r>
@@ -3659,8 +3618,6 @@
       <w:r>
         <w:t xml:space="preserve"> </w:t>
       </w:r>
-      <w:bookmarkStart w:id="0" w:name="_GoBack"/>
-      <w:bookmarkEnd w:id="0"/>
       <w:r>
         <w:t>Phát hành tiền giấy cũng như hoạt động vay / cho vay tín dụng của ngân hàng tối kỵ hành vi mờ ám vay nợ để trả nợ, hơn nữa, không thể trông chờ vận may để thanh toán lãi nợ chồng lãi nợ.</w:t>
       </w:r>
@@ -3759,9 +3716,6 @@
     <w:p/>
     <w:p>
       <w:r>
-        <w:rPr>
-          <w:highlight w:val="yellow"/>
-        </w:rPr>
         <w:t>Hoạt động cho vay tín dụng là hình thức mở rộng của phát hành tiền giấy</w:t>
       </w:r>
       <w:r>
@@ -3800,54 +3754,37 @@
     </w:p>
     <w:p>
       <w:r>
-        <w:rPr>
-          <w:highlight w:val="yellow"/>
-        </w:rPr>
         <w:t>Sự thuận tiện của lệnh phiếu</w:t>
       </w:r>
       <w:sdt>
         <w:sdtPr>
-          <w:rPr>
-            <w:highlight w:val="yellow"/>
-          </w:rPr>
           <w:id w:val="1380970477"/>
           <w:citation/>
         </w:sdtPr>
         <w:sdtEndPr/>
         <w:sdtContent>
           <w:r>
-            <w:rPr>
-              <w:highlight w:val="yellow"/>
-            </w:rPr>
-            <w:fldChar w:fldCharType="begin"/>
-          </w:r>
-          <w:r>
-            <w:rPr>
-              <w:highlight w:val="yellow"/>
-            </w:rPr>
+            <w:fldChar w:fldCharType="begin"/>
+          </w:r>
+          <w:r>
             <w:instrText xml:space="preserve">CITATION Smith1776Wealth \p 221 \l 1033 </w:instrText>
           </w:r>
           <w:r>
-            <w:rPr>
-              <w:highlight w:val="yellow"/>
-            </w:rPr>
-            <w:fldChar w:fldCharType="separate"/>
-          </w:r>
-          <w:r>
-            <w:rPr>
-              <w:noProof/>
-              <w:highlight w:val="yellow"/>
+            <w:fldChar w:fldCharType="separate"/>
+          </w:r>
+          <w:r>
+            <w:rPr>
+              <w:noProof/>
             </w:rPr>
             <w:t xml:space="preserve"> (Smith, 1776, p. 221)</w:t>
           </w:r>
           <w:r>
-            <w:rPr>
-              <w:highlight w:val="yellow"/>
-            </w:rPr>
-            <w:fldChar w:fldCharType="end"/>
-          </w:r>
-        </w:sdtContent>
-      </w:sdt>
+            <w:fldChar w:fldCharType="end"/>
+          </w:r>
+        </w:sdtContent>
+      </w:sdt>
+      <w:bookmarkStart w:id="0" w:name="_GoBack"/>
+      <w:bookmarkEnd w:id="0"/>
       <w:r>
         <w:t>.</w:t>
       </w:r>
@@ -4791,7 +4728,7 @@
 </file>
 
 <file path=customXml/itemProps1.xml><?xml version="1.0" encoding="utf-8"?>
-<ds:datastoreItem xmlns:ds="http://schemas.openxmlformats.org/officeDocument/2006/customXml" ds:itemID="{F45C57F0-601C-4C83-9C79-1AF6C9DE9E48}">
+<ds:datastoreItem xmlns:ds="http://schemas.openxmlformats.org/officeDocument/2006/customXml" ds:itemID="{F0564040-C5EF-4B68-96A5-497440498F25}">
   <ds:schemaRefs>
     <ds:schemaRef ds:uri="http://schemas.openxmlformats.org/officeDocument/2006/bibliography"/>
   </ds:schemaRefs>

</xml_diff>

<commit_message>
Update TDKT version 1.0 build 2026.05.13.
</commit_message>
<xml_diff>
--- a/articles/drafts/Notes-2025.08.02.docx
+++ b/articles/drafts/Notes-2025.08.02.docx
@@ -3783,16 +3783,149 @@
           </w:r>
         </w:sdtContent>
       </w:sdt>
+      <w:r>
+        <w:t>.</w:t>
+      </w:r>
+      <w:r>
+        <w:t xml:space="preserve"> Cho vay là hình thức giải phóng một nguồn lực cho nhà tư bản tập trung vào kinh doanh.</w:t>
+      </w:r>
+    </w:p>
+    <w:p/>
+    <w:p>
+      <w:r>
+        <w:rPr>
+          <w:highlight w:val="yellow"/>
+        </w:rPr>
+        <w:t>Chủ sở hữu góp vốn ngân hàng vay ngược lại vốn</w:t>
+      </w:r>
+      <w:r>
+        <w:rPr>
+          <w:highlight w:val="yellow"/>
+        </w:rPr>
+        <w:t xml:space="preserve"> góp</w:t>
+      </w:r>
+      <w:r>
+        <w:t>, ký phát hối phiếu liên tục</w:t>
+      </w:r>
+      <w:sdt>
+        <w:sdtPr>
+          <w:id w:val="1795865991"/>
+          <w:citation/>
+        </w:sdtPr>
+        <w:sdtEndPr/>
+        <w:sdtContent>
+          <w:r>
+            <w:fldChar w:fldCharType="begin"/>
+          </w:r>
+          <w:r>
+            <w:instrText xml:space="preserve">CITATION Smith1776Wealth \p 232 \l 1033 </w:instrText>
+          </w:r>
+          <w:r>
+            <w:fldChar w:fldCharType="separate"/>
+          </w:r>
+          <w:r>
+            <w:rPr>
+              <w:noProof/>
+            </w:rPr>
+            <w:t xml:space="preserve"> (Smith, 1776, p. 232)</w:t>
+          </w:r>
+          <w:r>
+            <w:fldChar w:fldCharType="end"/>
+          </w:r>
+        </w:sdtContent>
+      </w:sdt>
+      <w:r>
+        <w:t xml:space="preserve"> -&gt; tình trạng nghiêm trọng.</w:t>
+      </w:r>
+    </w:p>
+    <w:p/>
+    <w:p>
+      <w:r>
+        <w:t xml:space="preserve">“dự trữ hàng hóa để bán ra </w:t>
+      </w:r>
+      <w:r>
+        <w:rPr>
+          <w:rFonts w:cs="Times New Roman"/>
+        </w:rPr>
+        <w:t>→</w:t>
+      </w:r>
+      <w:r>
+        <w:t xml:space="preserve"> tích lũy vốn để tái sản xuất </w:t>
+      </w:r>
+      <w:r>
+        <w:rPr>
+          <w:rFonts w:cs="Times New Roman"/>
+        </w:rPr>
+        <w:t>→</w:t>
+      </w:r>
+      <w:r>
+        <w:t xml:space="preserve"> dự trữ hàng hóa để bán ra”. </w:t>
+      </w:r>
+      <w:r>
+        <w:rPr>
+          <w:highlight w:val="yellow"/>
+        </w:rPr>
+        <w:t>Tích lũy vốn để tái sản xuất do tiết kiệm</w:t>
+      </w:r>
+      <w:sdt>
+        <w:sdtPr>
+          <w:rPr>
+            <w:highlight w:val="yellow"/>
+          </w:rPr>
+          <w:id w:val="-1848326221"/>
+          <w:citation/>
+        </w:sdtPr>
+        <w:sdtEndPr/>
+        <w:sdtContent>
+          <w:r>
+            <w:rPr>
+              <w:highlight w:val="yellow"/>
+            </w:rPr>
+            <w:fldChar w:fldCharType="begin"/>
+          </w:r>
+          <w:r>
+            <w:rPr>
+              <w:highlight w:val="yellow"/>
+            </w:rPr>
+            <w:instrText xml:space="preserve">CITATION Smith1776Wealth \p 249 \l 1033 </w:instrText>
+          </w:r>
+          <w:r>
+            <w:rPr>
+              <w:highlight w:val="yellow"/>
+            </w:rPr>
+            <w:fldChar w:fldCharType="separate"/>
+          </w:r>
+          <w:r>
+            <w:rPr>
+              <w:noProof/>
+              <w:highlight w:val="yellow"/>
+            </w:rPr>
+            <w:t xml:space="preserve"> </w:t>
+          </w:r>
+          <w:r>
+            <w:rPr>
+              <w:noProof/>
+              <w:highlight w:val="yellow"/>
+            </w:rPr>
+            <w:t>(Smith, 1776, p. 249)</w:t>
+          </w:r>
+          <w:r>
+            <w:rPr>
+              <w:highlight w:val="yellow"/>
+            </w:rPr>
+            <w:fldChar w:fldCharType="end"/>
+          </w:r>
+        </w:sdtContent>
+      </w:sdt>
+      <w:r>
+        <w:t>?</w:t>
+      </w:r>
+      <w:r>
+        <w:t xml:space="preserve"> Tiết kiệm không hẳn ngược với chi tiêu tiêu dùng.</w:t>
+      </w:r>
       <w:bookmarkStart w:id="0" w:name="_GoBack"/>
       <w:bookmarkEnd w:id="0"/>
-      <w:r>
-        <w:t>.</w:t>
-      </w:r>
-      <w:r>
-        <w:t xml:space="preserve"> Cho vay là hình thức giải phóng một nguồn lực cho nhà tư bản tập trung vào kinh doanh.</w:t>
-      </w:r>
-    </w:p>
-    <w:p/>
+    </w:p>
     <w:p/>
     <w:p/>
     <w:p/>
@@ -3861,7 +3994,7 @@
           <w:rPr>
             <w:noProof/>
           </w:rPr>
-          <w:t>7</w:t>
+          <w:t>8</w:t>
         </w:r>
         <w:r>
           <w:rPr>
@@ -4728,7 +4861,7 @@
 </file>
 
 <file path=customXml/itemProps1.xml><?xml version="1.0" encoding="utf-8"?>
-<ds:datastoreItem xmlns:ds="http://schemas.openxmlformats.org/officeDocument/2006/customXml" ds:itemID="{F0564040-C5EF-4B68-96A5-497440498F25}">
+<ds:datastoreItem xmlns:ds="http://schemas.openxmlformats.org/officeDocument/2006/customXml" ds:itemID="{8F41ED32-711F-4D2E-A555-3002B5ADCE72}">
   <ds:schemaRefs>
     <ds:schemaRef ds:uri="http://schemas.openxmlformats.org/officeDocument/2006/bibliography"/>
   </ds:schemaRefs>

</xml_diff>